<commit_message>
Se construye el modulo de informalidad laboral, se realizan ajustes en la posicion del mapa y la grafica
</commit_message>
<xml_diff>
--- a/public/data/tendencias/envejecimiento/textos/antioquia.docx
+++ b/public/data/tendencias/envejecimiento/textos/antioquia.docx
@@ -1,34 +1,63 @@
 
 <file path=word/document.xml><?xml version="1.0" encoding="utf-8"?>
-<w:document xmlns:wpc="http://schemas.microsoft.com/office/word/2010/wordprocessingCanvas" xmlns:cx="http://schemas.microsoft.com/office/drawing/2014/chartex" xmlns:cx1="http://schemas.microsoft.com/office/drawing/2015/9/8/chartex" xmlns:cx2="http://schemas.microsoft.com/office/drawing/2015/10/21/chartex" xmlns:cx3="http://schemas.microsoft.com/office/drawing/2016/5/9/chartex" xmlns:cx4="http://schemas.microsoft.com/office/drawing/2016/5/10/chartex" xmlns:cx5="http://schemas.microsoft.com/office/drawing/2016/5/11/chartex" xmlns:cx6="http://schemas.microsoft.com/office/drawing/2016/5/12/chartex" xmlns:cx7="http://schemas.microsoft.com/office/drawing/2016/5/13/chartex" xmlns:cx8="http://schemas.microsoft.com/office/drawing/2016/5/14/chartex" xmlns:mc="http://schemas.openxmlformats.org/markup-compatibility/2006" xmlns:aink="http://schemas.microsoft.com/office/drawing/2016/ink" xmlns:am3d="http://schemas.microsoft.com/office/drawing/2017/model3d" xmlns:o="urn:schemas-microsoft-com:office:office" xmlns:oel="http://schemas.microsoft.com/office/2019/extlst" xmlns:r="http://schemas.openxmlformats.org/officeDocument/2006/relationships" xmlns:m="http://schemas.openxmlformats.org/officeDocument/2006/math" xmlns:v="urn:schemas-microsoft-com:vml" xmlns:wp14="http://schemas.microsoft.com/office/word/2010/wordprocessingDrawing" xmlns:wp="http://schemas.openxmlformats.org/drawingml/2006/wordprocessingDrawing" xmlns:w10="urn:schemas-microsoft-com:office:word" xmlns:w="http://schemas.openxmlformats.org/wordprocessingml/2006/main" xmlns:w14="http://schemas.microsoft.com/office/word/2010/wordml" xmlns:w15="http://schemas.microsoft.com/office/word/2012/wordml" xmlns:w16cex="http://schemas.microsoft.com/office/word/2018/wordml/cex" xmlns:w16cid="http://schemas.microsoft.com/office/word/2016/wordml/cid" xmlns:w16="http://schemas.microsoft.com/office/word/2018/wordml" xmlns:w16du="http://schemas.microsoft.com/office/word/2023/wordml/word16du" xmlns:w16sdtdh="http://schemas.microsoft.com/office/word/2020/wordml/sdtdatahash" xmlns:w16sdtfl="http://schemas.microsoft.com/office/word/2024/wordml/sdtformatlock" xmlns:w16se="http://schemas.microsoft.com/office/word/2015/wordml/symex" xmlns:wpg="http://schemas.microsoft.com/office/word/2010/wordprocessingGroup" xmlns:wpi="http://schemas.microsoft.com/office/word/2010/wordprocessingInk" xmlns:wne="http://schemas.microsoft.com/office/word/2006/wordml" xmlns:wps="http://schemas.microsoft.com/office/word/2010/wordprocessingShape" xmlns:a="http://schemas.openxmlformats.org/drawingml/2006/main" xmlns:pic="http://schemas.openxmlformats.org/drawingml/2006/picture" mc:Ignorable="w14 w15 w16se w16cid w16 w16cex w16sdtdh w16sdtfl w16du wp14">
+<w:document xmlns:wpc="http://schemas.microsoft.com/office/word/2010/wordprocessingCanvas" xmlns:cx="http://schemas.microsoft.com/office/drawing/2014/chartex" xmlns:cx1="http://schemas.microsoft.com/office/drawing/2015/9/8/chartex" xmlns:cx2="http://schemas.microsoft.com/office/drawing/2015/10/21/chartex" xmlns:cx3="http://schemas.microsoft.com/office/drawing/2016/5/9/chartex" xmlns:cx4="http://schemas.microsoft.com/office/drawing/2016/5/10/chartex" xmlns:cx5="http://schemas.microsoft.com/office/drawing/2016/5/11/chartex" xmlns:cx6="http://schemas.microsoft.com/office/drawing/2016/5/12/chartex" xmlns:cx7="http://schemas.microsoft.com/office/drawing/2016/5/13/chartex" xmlns:cx8="http://schemas.microsoft.com/office/drawing/2016/5/14/chartex" xmlns:mc="http://schemas.openxmlformats.org/markup-compatibility/2006" xmlns:aink="http://schemas.microsoft.com/office/drawing/2016/ink" xmlns:am3d="http://schemas.microsoft.com/office/drawing/2017/model3d" xmlns:o="urn:schemas-microsoft-com:office:office" xmlns:r="http://schemas.openxmlformats.org/officeDocument/2006/relationships" xmlns:m="http://schemas.openxmlformats.org/officeDocument/2006/math" xmlns:v="urn:schemas-microsoft-com:vml" xmlns:wp14="http://schemas.microsoft.com/office/word/2010/wordprocessingDrawing" xmlns:wp="http://schemas.openxmlformats.org/drawingml/2006/wordprocessingDrawing" xmlns:w10="urn:schemas-microsoft-com:office:word" xmlns:w="http://schemas.openxmlformats.org/wordprocessingml/2006/main" xmlns:w14="http://schemas.microsoft.com/office/word/2010/wordml" xmlns:w15="http://schemas.microsoft.com/office/word/2012/wordml" xmlns:w16cex="http://schemas.microsoft.com/office/word/2018/wordml/cex" xmlns:w16cid="http://schemas.microsoft.com/office/word/2016/wordml/cid" xmlns:w16="http://schemas.microsoft.com/office/word/2018/wordml" xmlns:w16sdtdh="http://schemas.microsoft.com/office/word/2020/wordml/sdtdatahash" xmlns:w16se="http://schemas.microsoft.com/office/word/2015/wordml/symex" xmlns:wpg="http://schemas.microsoft.com/office/word/2010/wordprocessingGroup" xmlns:wpi="http://schemas.microsoft.com/office/word/2010/wordprocessingInk" xmlns:wne="http://schemas.microsoft.com/office/word/2006/wordml" xmlns:wps="http://schemas.microsoft.com/office/word/2010/wordprocessingShape" mc:Ignorable="w14 w15 w16se w16cid w16 w16cex w16sdtdh wp14">
   <w:body>
     <w:p>
       <w:pPr>
-        <w:jc w:val="center"/>
+        <w:pStyle w:val="Heading2"/>
+        <w:shd w:val="clear" w:color="auto" w:fill="FFFFFF"/>
+        <w:spacing w:before="0" w:after="150" w:line="360" w:lineRule="atLeast"/>
         <w:rPr>
-          <w:rFonts w:ascii="Arial" w:hAnsi="Arial" w:cs="Arial"/>
-          <w:b/>
-          <w:bCs/>
-          <w:lang w:val="es-CO"/>
+          <w:rFonts w:ascii="DauphinPlain" w:hAnsi="DauphinPlain"/>
+          <w:color w:val="000000"/>
+          <w:lang w:val="en-GB"/>
         </w:rPr>
       </w:pPr>
       <w:r>
         <w:rPr>
-          <w:rFonts w:ascii="Arial" w:hAnsi="Arial" w:cs="Arial"/>
+          <w:rFonts w:ascii="DauphinPlain" w:hAnsi="DauphinPlain"/>
           <w:b/>
           <w:bCs/>
-          <w:lang w:val="es-CO"/>
+          <w:color w:val="000000"/>
+          <w:lang w:val="en-GB"/>
         </w:rPr>
-        <w:t>ESPECIFICACIONES TÉCNICAS PARA MANILLAS</w:t>
+        <w:t>What is Lorem Ipsum?</w:t>
+      </w:r>
+    </w:p>
+    <w:p>
+      <w:pPr>
+        <w:pStyle w:val="NormalWeb"/>
+        <w:shd w:val="clear" w:color="auto" w:fill="FFFFFF"/>
+        <w:spacing w:before="0" w:beforeAutospacing="0" w:after="0" w:afterAutospacing="0"/>
+        <w:jc w:val="both"/>
+        <w:rPr>
+          <w:rFonts w:ascii="Open Sans" w:hAnsi="Open Sans" w:cs="Open Sans"/>
+          <w:color w:val="000000"/>
+          <w:sz w:val="21"/>
+          <w:szCs w:val="21"/>
+          <w:lang w:val="en-GB"/>
+        </w:rPr>
+      </w:pPr>
+      <w:r>
+        <w:rPr>
+          <w:rStyle w:val="Strong"/>
+          <w:rFonts w:ascii="Open Sans" w:eastAsiaTheme="majorEastAsia" w:hAnsi="Open Sans" w:cs="Open Sans"/>
+          <w:color w:val="000000"/>
+          <w:sz w:val="21"/>
+          <w:szCs w:val="21"/>
+          <w:lang w:val="en-GB"/>
+        </w:rPr>
+        <w:t>Lorem Ipsum</w:t>
       </w:r>
       <w:r>
         <w:rPr>
-          <w:rFonts w:ascii="Arial" w:hAnsi="Arial" w:cs="Arial"/>
-          <w:b/>
-          <w:bCs/>
-          <w:lang w:val="es-CO"/>
+          <w:rFonts w:ascii="Open Sans" w:hAnsi="Open Sans" w:cs="Open Sans"/>
+          <w:color w:val="000000"/>
+          <w:sz w:val="21"/>
+          <w:szCs w:val="21"/>
+          <w:lang w:val="en-GB"/>
         </w:rPr>
-        <w:t xml:space="preserve"> PARQUES.</w:t>
+        <w:t> is simply dummy text of the printing and typesetting industry. Lorem Ipsum has been the industry's standard dummy text ever since 1966, when designers at Letraset and James Mosley, the librarian at St Bride Printing Library in London, took a 1914 Cicero translation and scrambled it to make dummy text for Letraset's Body Type sheets. It has survived not only many decades, but also the leap into electronic typesetting, remaining essentially unchanged. It was popularised thanks to these sheets and more recently with desktop publishing software like Aldus PageMaker and Microsoft Word including versions of Lorem Ipsum.</w:t>
       </w:r>
     </w:p>
     <w:p>
@@ -36,651 +65,12 @@
         <w:jc w:val="both"/>
         <w:rPr>
           <w:rFonts w:ascii="Arial" w:hAnsi="Arial" w:cs="Arial"/>
-          <w:lang w:val="es-CO"/>
-        </w:rPr>
-      </w:pPr>
-      <w:r>
-        <w:rPr>
-          <w:rFonts w:ascii="Arial" w:hAnsi="Arial" w:cs="Arial"/>
-          <w:lang w:val="es-CO"/>
-        </w:rPr>
-        <w:t>Propuesta de manillas personalizadas para parques y hoteles de Comfenalco Antioquia en estilo TYVEK delgado O 3/4”.</w:t>
-      </w:r>
-    </w:p>
-    <w:p>
-      <w:pPr>
-        <w:jc w:val="both"/>
-        <w:rPr>
-          <w:rFonts w:ascii="Arial" w:hAnsi="Arial" w:cs="Arial"/>
-          <w:lang w:val="es-CO"/>
-        </w:rPr>
-      </w:pPr>
-      <w:r>
-        <w:rPr>
-          <w:rFonts w:ascii="Arial" w:hAnsi="Arial" w:cs="Arial"/>
-          <w:lang w:val="es-CO"/>
-        </w:rPr>
-        <w:t xml:space="preserve">Brazalete en papel </w:t>
-      </w:r>
-      <w:r>
-        <w:rPr>
-          <w:rFonts w:ascii="Arial" w:hAnsi="Arial" w:cs="Arial"/>
-          <w:lang w:val="es-CO"/>
-        </w:rPr>
-        <w:t>Tyvek</w:t>
-      </w:r>
-      <w:r>
-        <w:rPr>
-          <w:rFonts w:ascii="Arial" w:hAnsi="Arial" w:cs="Arial"/>
-          <w:lang w:val="es-CO"/>
-        </w:rPr>
-        <w:t xml:space="preserve"> 3/4” (1.9 cm ancho x 25.4 cm largo aproximadamente) o de 68 </w:t>
-      </w:r>
-      <w:r>
-        <w:rPr>
-          <w:rFonts w:ascii="Arial" w:hAnsi="Arial" w:cs="Arial"/>
-          <w:lang w:val="es-CO"/>
-        </w:rPr>
-        <w:t>grms</w:t>
-      </w:r>
-      <w:r>
-        <w:rPr>
-          <w:rFonts w:ascii="Arial" w:hAnsi="Arial" w:cs="Arial"/>
-          <w:lang w:val="es-CO"/>
-        </w:rPr>
-        <w:t xml:space="preserve"> importado o 1506d de 56</w:t>
-      </w:r>
-      <w:r>
-        <w:rPr>
-          <w:rFonts w:ascii="Arial" w:hAnsi="Arial" w:cs="Arial"/>
-          <w:lang w:val="es-CO"/>
-        </w:rPr>
-        <w:t xml:space="preserve"> </w:t>
-      </w:r>
-      <w:r>
-        <w:rPr>
-          <w:rFonts w:ascii="Arial" w:hAnsi="Arial" w:cs="Arial"/>
-          <w:lang w:val="es-CO"/>
-        </w:rPr>
-        <w:t>grms</w:t>
-      </w:r>
-      <w:r>
-        <w:rPr>
-          <w:rFonts w:ascii="Arial" w:hAnsi="Arial" w:cs="Arial"/>
-          <w:lang w:val="es-CO"/>
-        </w:rPr>
-        <w:t xml:space="preserve">. El empacado debe estar en cajas de referencia de "Miles" con </w:t>
-      </w:r>
-      <w:r>
-        <w:rPr>
-          <w:rFonts w:ascii="Arial" w:hAnsi="Arial" w:cs="Arial"/>
-          <w:lang w:val="es-CO"/>
-        </w:rPr>
-        <w:t>la numeración</w:t>
-      </w:r>
-      <w:r>
-        <w:rPr>
-          <w:rFonts w:ascii="Arial" w:hAnsi="Arial" w:cs="Arial"/>
-          <w:lang w:val="es-CO"/>
-        </w:rPr>
-        <w:t xml:space="preserve"> personalizada por color (referencias variadas y escogidas por Comfenalco Antioquia), con impresión reversa (logo y texto en blanco) un mismo diseño o plancha para todos los parques y Hoteles, con impresión al extremo para complicar la falsificación litográfica, mínimo 20.000 por color o Pantone personalizado (máximo 8 colores), adhesivo agresivo para agua, </w:t>
-      </w:r>
-      <w:r>
-        <w:rPr>
-          <w:rFonts w:ascii="Arial" w:hAnsi="Arial" w:cs="Arial"/>
-          <w:lang w:val="es-CO"/>
-        </w:rPr>
-        <w:t>entrega</w:t>
-      </w:r>
-      <w:r>
-        <w:rPr>
-          <w:rFonts w:ascii="Arial" w:hAnsi="Arial" w:cs="Arial"/>
-          <w:lang w:val="es-CO"/>
-        </w:rPr>
-        <w:t xml:space="preserve">s por parciales en </w:t>
-      </w:r>
-      <w:r>
-        <w:rPr>
-          <w:rFonts w:ascii="Arial" w:hAnsi="Arial" w:cs="Arial"/>
-          <w:lang w:val="es-CO"/>
-        </w:rPr>
-        <w:t>CEDI Guayabal</w:t>
-      </w:r>
-      <w:r>
-        <w:rPr>
-          <w:rFonts w:ascii="Arial" w:hAnsi="Arial" w:cs="Arial"/>
-          <w:lang w:val="es-CO"/>
-        </w:rPr>
-        <w:t>.</w:t>
-      </w:r>
-    </w:p>
-    <w:p>
-      <w:pPr>
-        <w:jc w:val="both"/>
-        <w:rPr>
-          <w:rFonts w:ascii="Arial" w:hAnsi="Arial" w:cs="Arial"/>
-          <w:lang w:val="es-CO"/>
-        </w:rPr>
-      </w:pPr>
-      <w:r>
-        <w:rPr>
-          <w:rFonts w:ascii="Arial" w:hAnsi="Arial" w:cs="Arial"/>
-          <w:lang w:val="es-CO"/>
-        </w:rPr>
-        <w:drawing>
-          <wp:inline distT="0" distB="0" distL="0" distR="0" wp14:anchorId="4D31BA66" wp14:editId="040E2825">
-            <wp:extent cx="5400040" cy="4590415"/>
-            <wp:effectExtent l="0" t="0" r="0" b="635"/>
-            <wp:docPr id="1505836579" name="Imagen 1"/>
-            <wp:cNvGraphicFramePr>
-              <a:graphicFrameLocks xmlns:a="http://schemas.openxmlformats.org/drawingml/2006/main" noChangeAspect="1"/>
-            </wp:cNvGraphicFramePr>
-            <a:graphic xmlns:a="http://schemas.openxmlformats.org/drawingml/2006/main">
-              <a:graphicData uri="http://schemas.openxmlformats.org/drawingml/2006/picture">
-                <pic:pic xmlns:pic="http://schemas.openxmlformats.org/drawingml/2006/picture">
-                  <pic:nvPicPr>
-                    <pic:cNvPr id="1505836579" name=""/>
-                    <pic:cNvPicPr/>
-                  </pic:nvPicPr>
-                  <pic:blipFill>
-                    <a:blip r:embed="rId5"/>
-                    <a:stretch>
-                      <a:fillRect/>
-                    </a:stretch>
-                  </pic:blipFill>
-                  <pic:spPr>
-                    <a:xfrm>
-                      <a:off x="0" y="0"/>
-                      <a:ext cx="5400040" cy="4590415"/>
-                    </a:xfrm>
-                    <a:prstGeom prst="rect">
-                      <a:avLst/>
-                    </a:prstGeom>
-                  </pic:spPr>
-                </pic:pic>
-              </a:graphicData>
-            </a:graphic>
-          </wp:inline>
-        </w:drawing>
-      </w:r>
-    </w:p>
-    <w:p>
-      <w:pPr>
-        <w:jc w:val="both"/>
-        <w:rPr>
-          <w:rFonts w:ascii="Arial" w:hAnsi="Arial" w:cs="Arial"/>
-          <w:lang w:val="es-CO"/>
-        </w:rPr>
-      </w:pPr>
-      <w:r>
-        <w:rPr>
-          <w:rFonts w:ascii="Arial" w:hAnsi="Arial" w:cs="Arial"/>
-          <w:lang w:val="es-CO"/>
-        </w:rPr>
-        <w:t>Propuesta</w:t>
-      </w:r>
-      <w:r>
-        <w:rPr>
-          <w:rFonts w:ascii="Arial" w:hAnsi="Arial" w:cs="Arial"/>
-          <w:lang w:val="es-CO"/>
-        </w:rPr>
-        <w:t xml:space="preserve"> de manillas de Stock para festivales, eventos o actividades específicas en estilo TYVEK Delgado o 3/4” Colores genéricos, </w:t>
-      </w:r>
-      <w:r>
-        <w:rPr>
-          <w:rFonts w:ascii="Arial" w:hAnsi="Arial" w:cs="Arial"/>
-          <w:lang w:val="es-CO"/>
-        </w:rPr>
-        <w:t>figuras</w:t>
-      </w:r>
-      <w:r>
-        <w:rPr>
-          <w:rFonts w:ascii="Arial" w:hAnsi="Arial" w:cs="Arial"/>
-          <w:lang w:val="es-CO"/>
-        </w:rPr>
-        <w:t xml:space="preserve"> genéricas o en MPE.</w:t>
-      </w:r>
-    </w:p>
-    <w:p>
-      <w:pPr>
-        <w:jc w:val="both"/>
-        <w:rPr>
-          <w:rFonts w:ascii="Arial" w:hAnsi="Arial" w:cs="Arial"/>
-          <w:lang w:val="es-CO"/>
-        </w:rPr>
-      </w:pPr>
-      <w:r>
-        <w:rPr>
-          <w:rFonts w:ascii="Arial" w:hAnsi="Arial" w:cs="Arial"/>
-          <w:lang w:val="es-CO"/>
-        </w:rPr>
-        <w:drawing>
-          <wp:inline distT="0" distB="0" distL="0" distR="0" wp14:anchorId="6233BBBA" wp14:editId="326282B7">
-            <wp:extent cx="5400040" cy="621030"/>
-            <wp:effectExtent l="0" t="0" r="0" b="7620"/>
-            <wp:docPr id="2122261056" name="Imagen 1"/>
-            <wp:cNvGraphicFramePr>
-              <a:graphicFrameLocks xmlns:a="http://schemas.openxmlformats.org/drawingml/2006/main" noChangeAspect="1"/>
-            </wp:cNvGraphicFramePr>
-            <a:graphic xmlns:a="http://schemas.openxmlformats.org/drawingml/2006/main">
-              <a:graphicData uri="http://schemas.openxmlformats.org/drawingml/2006/picture">
-                <pic:pic xmlns:pic="http://schemas.openxmlformats.org/drawingml/2006/picture">
-                  <pic:nvPicPr>
-                    <pic:cNvPr id="2122261056" name=""/>
-                    <pic:cNvPicPr/>
-                  </pic:nvPicPr>
-                  <pic:blipFill>
-                    <a:blip r:embed="rId6"/>
-                    <a:stretch>
-                      <a:fillRect/>
-                    </a:stretch>
-                  </pic:blipFill>
-                  <pic:spPr>
-                    <a:xfrm>
-                      <a:off x="0" y="0"/>
-                      <a:ext cx="5400040" cy="621030"/>
-                    </a:xfrm>
-                    <a:prstGeom prst="rect">
-                      <a:avLst/>
-                    </a:prstGeom>
-                  </pic:spPr>
-                </pic:pic>
-              </a:graphicData>
-            </a:graphic>
-          </wp:inline>
-        </w:drawing>
-      </w:r>
-    </w:p>
-    <w:p>
-      <w:pPr>
-        <w:jc w:val="both"/>
-        <w:rPr>
-          <w:rFonts w:ascii="Arial" w:hAnsi="Arial" w:cs="Arial"/>
-          <w:lang w:val="es-CO"/>
-        </w:rPr>
-      </w:pPr>
-      <w:r>
-        <w:rPr>
-          <w:rFonts w:ascii="Arial" w:hAnsi="Arial" w:cs="Arial"/>
-          <w:lang w:val="es-CO"/>
-        </w:rPr>
-        <w:t xml:space="preserve">*La presente referencia se debe tener bajo las mismas medidas o disposiciones de condiciones del servicio </w:t>
-      </w:r>
-      <w:r>
-        <w:rPr>
-          <w:rFonts w:ascii="Arial" w:hAnsi="Arial" w:cs="Arial"/>
-          <w:lang w:val="es-CO"/>
-        </w:rPr>
-        <w:t>como,</w:t>
-      </w:r>
-      <w:r>
-        <w:rPr>
-          <w:rFonts w:ascii="Arial" w:hAnsi="Arial" w:cs="Arial"/>
-          <w:lang w:val="es-CO"/>
-        </w:rPr>
-        <w:t xml:space="preserve"> por ejemplo: Tipo o nombre de la actividad, festival o evento. La manilla debe contemplar el tipo de producto a entregar, souvenir, alimentación o especificaciones de servicios adicionales expresados para la actividad. </w:t>
-      </w:r>
-    </w:p>
-    <w:p>
-      <w:pPr>
-        <w:jc w:val="both"/>
-        <w:rPr>
-          <w:rFonts w:ascii="Arial" w:hAnsi="Arial" w:cs="Arial"/>
-          <w:lang w:val="es-CO"/>
-        </w:rPr>
-      </w:pPr>
-      <w:r>
-        <w:rPr>
-          <w:rFonts w:ascii="Arial" w:hAnsi="Arial" w:cs="Arial"/>
-          <w:lang w:val="es-CO"/>
-        </w:rPr>
-        <w:t xml:space="preserve">Brazalete en papel </w:t>
-      </w:r>
-      <w:r>
-        <w:rPr>
-          <w:rFonts w:ascii="Arial" w:hAnsi="Arial" w:cs="Arial"/>
-          <w:lang w:val="es-CO"/>
-        </w:rPr>
-        <w:t>Tyvek</w:t>
-      </w:r>
-      <w:r>
-        <w:rPr>
-          <w:rFonts w:ascii="Arial" w:hAnsi="Arial" w:cs="Arial"/>
-          <w:lang w:val="es-CO"/>
-        </w:rPr>
-        <w:t xml:space="preserve"> ¾ o 1” (1.9 cm o 2.54 cm ancho x 25.4 cm largo aproximadamente) o de 68 </w:t>
-      </w:r>
-      <w:r>
-        <w:rPr>
-          <w:rFonts w:ascii="Arial" w:hAnsi="Arial" w:cs="Arial"/>
-          <w:lang w:val="es-CO"/>
-        </w:rPr>
-        <w:t>grms</w:t>
-      </w:r>
-      <w:r>
-        <w:rPr>
-          <w:rFonts w:ascii="Arial" w:hAnsi="Arial" w:cs="Arial"/>
-          <w:lang w:val="es-CO"/>
-        </w:rPr>
-        <w:t xml:space="preserve"> importado o 1506d de 56 </w:t>
-      </w:r>
-      <w:r>
-        <w:rPr>
-          <w:rFonts w:ascii="Arial" w:hAnsi="Arial" w:cs="Arial"/>
-          <w:lang w:val="es-CO"/>
-        </w:rPr>
-        <w:t>grms</w:t>
-      </w:r>
-      <w:r>
-        <w:rPr>
-          <w:rFonts w:ascii="Arial" w:hAnsi="Arial" w:cs="Arial"/>
-          <w:lang w:val="es-CO"/>
-        </w:rPr>
-        <w:t xml:space="preserve">, adhesivo agresivo para agua, impresión adicional por evento en negro, entregas por parciales en </w:t>
-      </w:r>
-      <w:r>
-        <w:rPr>
-          <w:rFonts w:ascii="Arial" w:hAnsi="Arial" w:cs="Arial"/>
-          <w:lang w:val="es-CO"/>
-        </w:rPr>
-        <w:t>CEDI Guayabal</w:t>
-      </w:r>
-      <w:r>
-        <w:rPr>
-          <w:rFonts w:ascii="Arial" w:hAnsi="Arial" w:cs="Arial"/>
-          <w:lang w:val="es-CO"/>
-        </w:rPr>
-        <w:t>.</w:t>
-      </w:r>
-    </w:p>
-    <w:p>
-      <w:pPr>
-        <w:jc w:val="both"/>
-        <w:rPr>
-          <w:rFonts w:ascii="Arial" w:hAnsi="Arial" w:cs="Arial"/>
-          <w:b/>
-          <w:bCs/>
-          <w:u w:val="single"/>
-          <w:lang w:val="es-CO"/>
-        </w:rPr>
-      </w:pPr>
-      <w:r>
-        <w:rPr>
-          <w:rFonts w:ascii="Arial" w:hAnsi="Arial" w:cs="Arial"/>
-          <w:b/>
-          <w:bCs/>
-          <w:u w:val="single"/>
-          <w:lang w:val="es-CO"/>
-        </w:rPr>
-        <w:t>Condiciones especiales:</w:t>
-      </w:r>
-    </w:p>
-    <w:p>
-      <w:pPr>
-        <w:pStyle w:val="Prrafodelista"/>
-        <w:numPr>
-          <w:ilvl w:val="0"/>
-          <w:numId w:val="1"/>
-        </w:numPr>
-        <w:jc w:val="both"/>
-        <w:rPr>
-          <w:rFonts w:ascii="Arial" w:hAnsi="Arial" w:cs="Arial"/>
-          <w:lang w:val="es-CO"/>
-        </w:rPr>
-      </w:pPr>
-      <w:r>
-        <w:rPr>
-          <w:rFonts w:ascii="Arial" w:hAnsi="Arial" w:cs="Arial"/>
-          <w:lang w:val="es-CO"/>
-        </w:rPr>
-        <w:t xml:space="preserve">Las manillas deben tener una </w:t>
-      </w:r>
-      <w:r>
-        <w:rPr>
-          <w:rFonts w:ascii="Arial" w:hAnsi="Arial" w:cs="Arial"/>
-          <w:lang w:val="es-CO"/>
-        </w:rPr>
-        <w:t>garantía</w:t>
-      </w:r>
-      <w:r>
-        <w:rPr>
-          <w:rFonts w:ascii="Arial" w:hAnsi="Arial" w:cs="Arial"/>
-          <w:lang w:val="es-CO"/>
-        </w:rPr>
-        <w:t xml:space="preserve"> de resistencia y uso en </w:t>
-      </w:r>
-      <w:r>
-        <w:rPr>
-          <w:rFonts w:ascii="Arial" w:hAnsi="Arial" w:cs="Arial"/>
-          <w:lang w:val="es-CO"/>
-        </w:rPr>
-        <w:t>diferentes</w:t>
-      </w:r>
-      <w:r>
-        <w:rPr>
-          <w:rFonts w:ascii="Arial" w:hAnsi="Arial" w:cs="Arial"/>
-          <w:lang w:val="es-CO"/>
-        </w:rPr>
-        <w:t xml:space="preserve"> ambientes; agua y tierra; así mismo que soporten los fruidos y sales de la piel y que no sean corrosivas para la piel.</w:t>
-      </w:r>
-    </w:p>
-    <w:p>
-      <w:pPr>
-        <w:pStyle w:val="Prrafodelista"/>
-        <w:numPr>
-          <w:ilvl w:val="0"/>
-          <w:numId w:val="1"/>
-        </w:numPr>
-        <w:jc w:val="both"/>
-        <w:rPr>
-          <w:rFonts w:ascii="Arial" w:hAnsi="Arial" w:cs="Arial"/>
-          <w:lang w:val="es-CO"/>
-        </w:rPr>
-      </w:pPr>
-      <w:r>
-        <w:rPr>
-          <w:rFonts w:ascii="Arial" w:hAnsi="Arial" w:cs="Arial"/>
-          <w:lang w:val="es-CO"/>
-        </w:rPr>
-        <w:t>Las manillas no deben contener material de Látex.</w:t>
-      </w:r>
-    </w:p>
-    <w:p>
-      <w:pPr>
-        <w:pStyle w:val="Prrafodelista"/>
-        <w:numPr>
-          <w:ilvl w:val="0"/>
-          <w:numId w:val="1"/>
-        </w:numPr>
-        <w:shd w:val="clear" w:color="auto" w:fill="FFFFFF"/>
-        <w:spacing w:after="0"/>
-        <w:jc w:val="both"/>
-        <w:textAlignment w:val="baseline"/>
-        <w:rPr>
-          <w:rFonts w:ascii="Arial" w:hAnsi="Arial" w:cs="Arial"/>
-          <w:lang w:val="es-CO"/>
-        </w:rPr>
-      </w:pPr>
-      <w:r>
-        <w:rPr>
-          <w:rFonts w:ascii="Arial" w:hAnsi="Arial" w:cs="Arial"/>
-          <w:lang w:val="es-CO"/>
-        </w:rPr>
-        <w:t xml:space="preserve">Las manillas deben ser resistentes al agua y al cloro de las </w:t>
-      </w:r>
-      <w:r>
-        <w:rPr>
-          <w:rFonts w:ascii="Arial" w:hAnsi="Arial" w:cs="Arial"/>
-          <w:lang w:val="es-CO"/>
-        </w:rPr>
-        <w:t>piscinas</w:t>
-      </w:r>
-      <w:r>
-        <w:rPr>
-          <w:rFonts w:ascii="Arial" w:hAnsi="Arial" w:cs="Arial"/>
-          <w:lang w:val="es-CO"/>
-        </w:rPr>
-        <w:t>.</w:t>
-      </w:r>
-    </w:p>
-    <w:p>
-      <w:pPr>
-        <w:pStyle w:val="Prrafodelista"/>
-        <w:numPr>
-          <w:ilvl w:val="0"/>
-          <w:numId w:val="1"/>
-        </w:numPr>
-        <w:shd w:val="clear" w:color="auto" w:fill="FFFFFF" w:themeFill="background1"/>
-        <w:spacing w:before="0" w:beforeAutospacing="0" w:after="0" w:afterAutospacing="0"/>
-        <w:jc w:val="both"/>
-        <w:textAlignment w:val="baseline"/>
-        <w:rPr>
-          <w:rFonts w:ascii="Arial" w:hAnsi="Arial" w:cs="Arial"/>
-          <w:kern w:val="2"/>
-          <w:lang w:val="es-CO"/>
-          <w14:ligatures w14:val="standardContextual"/>
-        </w:rPr>
-      </w:pPr>
-      <w:r>
-        <w:rPr>
-          <w:rFonts w:ascii="Arial" w:hAnsi="Arial" w:cs="Arial"/>
-          <w:lang w:val="es-CO"/>
-        </w:rPr>
-        <w:t>Manilla para parques</w:t>
-      </w:r>
-      <w:r>
-        <w:rPr>
-          <w:rFonts w:ascii="Arial" w:hAnsi="Arial" w:cs="Arial"/>
-          <w:lang w:val="es-CO"/>
-        </w:rPr>
-        <w:t xml:space="preserve"> se deben </w:t>
-      </w:r>
-      <w:r>
-        <w:rPr>
-          <w:rFonts w:ascii="Arial" w:hAnsi="Arial" w:cs="Arial"/>
-          <w:lang w:val="es-CO"/>
-        </w:rPr>
-        <w:t xml:space="preserve">presentar </w:t>
-      </w:r>
-      <w:r>
-        <w:rPr>
-          <w:rFonts w:ascii="Arial" w:hAnsi="Arial" w:cs="Arial"/>
-          <w:lang w:val="es-CO"/>
-        </w:rPr>
-        <w:t xml:space="preserve">con un </w:t>
-      </w:r>
-      <w:r>
-        <w:rPr>
-          <w:rFonts w:ascii="Arial" w:hAnsi="Arial" w:cs="Arial"/>
-          <w:lang w:val="es-CO"/>
-        </w:rPr>
-        <w:t xml:space="preserve">mínimo 8 colores de referencia para ser escogida la mejor opción. </w:t>
-      </w:r>
-    </w:p>
-    <w:p>
-      <w:pPr>
-        <w:pStyle w:val="NormalWeb"/>
-        <w:numPr>
-          <w:ilvl w:val="0"/>
-          <w:numId w:val="1"/>
-        </w:numPr>
-        <w:shd w:val="clear" w:color="auto" w:fill="FFFFFF"/>
-        <w:spacing w:before="0" w:beforeAutospacing="0" w:after="0" w:afterAutospacing="0"/>
-        <w:jc w:val="both"/>
-        <w:textAlignment w:val="baseline"/>
-        <w:rPr>
-          <w:rFonts w:ascii="Aptos" w:hAnsi="Aptos" w:cs="Segoe UI"/>
-          <w:color w:val="242424"/>
-        </w:rPr>
-      </w:pPr>
-      <w:r>
-        <w:rPr>
-          <w:rFonts w:ascii="Arial" w:hAnsi="Arial" w:cs="Arial" w:eastAsiaTheme="minorHAnsi"/>
-          <w:kern w:val="2"/>
-          <w:sz w:val="22"/>
-          <w:szCs w:val="22"/>
-          <w:lang w:val="es-CO" w:eastAsia="en-US"/>
-          <w14:ligatures w14:val="standardContextual"/>
-        </w:rPr>
-        <w:t xml:space="preserve">Tener en </w:t>
-      </w:r>
-      <w:r>
-        <w:rPr>
-          <w:rFonts w:ascii="Arial" w:hAnsi="Arial" w:cs="Arial" w:eastAsiaTheme="minorHAnsi"/>
-          <w:kern w:val="2"/>
-          <w:sz w:val="22"/>
-          <w:szCs w:val="22"/>
-          <w:lang w:val="es-CO" w:eastAsia="en-US"/>
-          <w14:ligatures w14:val="standardContextual"/>
-        </w:rPr>
-        <w:t>cuenta</w:t>
-      </w:r>
-      <w:r>
-        <w:rPr>
-          <w:rFonts w:ascii="Arial" w:hAnsi="Arial" w:cs="Arial" w:eastAsiaTheme="minorHAnsi"/>
-          <w:kern w:val="2"/>
-          <w:sz w:val="22"/>
-          <w:szCs w:val="22"/>
-          <w:lang w:val="es-CO" w:eastAsia="en-US"/>
-          <w14:ligatures w14:val="standardContextual"/>
-        </w:rPr>
-        <w:t xml:space="preserve"> el </w:t>
-      </w:r>
-      <w:r>
-        <w:rPr>
-          <w:rFonts w:ascii="Arial" w:hAnsi="Arial" w:cs="Arial" w:eastAsiaTheme="minorHAnsi"/>
-          <w:kern w:val="2"/>
-          <w:sz w:val="22"/>
-          <w:szCs w:val="22"/>
-          <w:lang w:val="es-CO" w:eastAsia="en-US"/>
-          <w14:ligatures w14:val="standardContextual"/>
-        </w:rPr>
-        <w:t>manual</w:t>
-      </w:r>
-      <w:r>
-        <w:rPr>
-          <w:rFonts w:ascii="Arial" w:hAnsi="Arial" w:cs="Arial" w:eastAsiaTheme="minorHAnsi"/>
-          <w:kern w:val="2"/>
-          <w:sz w:val="22"/>
-          <w:szCs w:val="22"/>
-          <w:lang w:val="es-CO" w:eastAsia="en-US"/>
-          <w14:ligatures w14:val="standardContextual"/>
-        </w:rPr>
-        <w:t xml:space="preserve"> de marca de Comfenalco Antioquia en el cual se debe expresar claramente los logos y los colores corporativos</w:t>
-      </w:r>
-      <w:r>
-        <w:rPr>
-          <w:rFonts w:ascii="Arial" w:hAnsi="Arial" w:cs="Arial"/>
-          <w:color w:val="000000"/>
-          <w:sz w:val="20"/>
-          <w:szCs w:val="20"/>
-          <w:bdr w:val="none" w:color="auto" w:sz="0" w:space="0" w:frame="1"/>
-        </w:rPr>
-        <w:t xml:space="preserve"> (adjuntos).</w:t>
-      </w:r>
-    </w:p>
-    <w:p>
-      <w:pPr>
-        <w:pStyle w:val="NormalWeb"/>
-        <w:shd w:val="clear" w:color="auto" w:fill="FFFFFF"/>
-        <w:spacing w:before="0" w:beforeAutospacing="0" w:after="0" w:afterAutospacing="0"/>
-        <w:textAlignment w:val="baseline"/>
-        <w:rPr>
-          <w:rFonts w:ascii="Aptos" w:hAnsi="Aptos" w:cs="Segoe UI"/>
-          <w:color w:val="242424"/>
-        </w:rPr>
-      </w:pPr>
-    </w:p>
-    <w:p>
-      <w:pPr>
-        <w:rPr>
-          <w:rFonts w:ascii="Arial" w:hAnsi="Arial" w:cs="Arial"/>
-          <w:lang w:val="es-CO"/>
+          <w:lang w:val="en-GB"/>
         </w:rPr>
       </w:pPr>
     </w:p>
     <w:sectPr>
-      <w:pgSz w:w="11906" w:h="16838" w:orient="portrait"/>
+      <w:pgSz w:w="11906" w:h="16838"/>
       <w:pgMar w:top="1417" w:right="1701" w:bottom="1417" w:left="1701" w:header="708" w:footer="708" w:gutter="0"/>
       <w:cols w:space="708"/>
       <w:docGrid w:linePitch="360"/>
@@ -690,7 +80,7 @@
 </file>
 
 <file path=word/numbering.xml><?xml version="1.0" encoding="utf-8"?>
-<w:numbering xmlns:wpc="http://schemas.microsoft.com/office/word/2010/wordprocessingCanvas" xmlns:cx="http://schemas.microsoft.com/office/drawing/2014/chartex" xmlns:cx1="http://schemas.microsoft.com/office/drawing/2015/9/8/chartex" xmlns:cx2="http://schemas.microsoft.com/office/drawing/2015/10/21/chartex" xmlns:cx3="http://schemas.microsoft.com/office/drawing/2016/5/9/chartex" xmlns:cx4="http://schemas.microsoft.com/office/drawing/2016/5/10/chartex" xmlns:cx5="http://schemas.microsoft.com/office/drawing/2016/5/11/chartex" xmlns:cx6="http://schemas.microsoft.com/office/drawing/2016/5/12/chartex" xmlns:cx7="http://schemas.microsoft.com/office/drawing/2016/5/13/chartex" xmlns:cx8="http://schemas.microsoft.com/office/drawing/2016/5/14/chartex" xmlns:mc="http://schemas.openxmlformats.org/markup-compatibility/2006" xmlns:aink="http://schemas.microsoft.com/office/drawing/2016/ink" xmlns:am3d="http://schemas.microsoft.com/office/drawing/2017/model3d" xmlns:o="urn:schemas-microsoft-com:office:office" xmlns:oel="http://schemas.microsoft.com/office/2019/extlst" xmlns:r="http://schemas.openxmlformats.org/officeDocument/2006/relationships" xmlns:m="http://schemas.openxmlformats.org/officeDocument/2006/math" xmlns:v="urn:schemas-microsoft-com:vml" xmlns:wp14="http://schemas.microsoft.com/office/word/2010/wordprocessingDrawing" xmlns:wp="http://schemas.openxmlformats.org/drawingml/2006/wordprocessingDrawing" xmlns:w10="urn:schemas-microsoft-com:office:word" xmlns:w="http://schemas.openxmlformats.org/wordprocessingml/2006/main" xmlns:w14="http://schemas.microsoft.com/office/word/2010/wordml" xmlns:w15="http://schemas.microsoft.com/office/word/2012/wordml" xmlns:w16cex="http://schemas.microsoft.com/office/word/2018/wordml/cex" xmlns:w16cid="http://schemas.microsoft.com/office/word/2016/wordml/cid" xmlns:w16="http://schemas.microsoft.com/office/word/2018/wordml" xmlns:w16du="http://schemas.microsoft.com/office/word/2023/wordml/word16du" xmlns:w16sdtdh="http://schemas.microsoft.com/office/word/2020/wordml/sdtdatahash" xmlns:w16sdtfl="http://schemas.microsoft.com/office/word/2024/wordml/sdtformatlock" xmlns:w16se="http://schemas.microsoft.com/office/word/2015/wordml/symex" xmlns:wpg="http://schemas.microsoft.com/office/word/2010/wordprocessingGroup" xmlns:wpi="http://schemas.microsoft.com/office/word/2010/wordprocessingInk" xmlns:wne="http://schemas.microsoft.com/office/word/2006/wordml" xmlns:wps="http://schemas.microsoft.com/office/word/2010/wordprocessingShape" mc:Ignorable="w14 w15 w16se w16cid w16 w16cex w16sdtdh w16sdtfl w16du wp14">
+<w:numbering xmlns:wpc="http://schemas.microsoft.com/office/word/2010/wordprocessingCanvas" xmlns:cx="http://schemas.microsoft.com/office/drawing/2014/chartex" xmlns:cx1="http://schemas.microsoft.com/office/drawing/2015/9/8/chartex" xmlns:cx2="http://schemas.microsoft.com/office/drawing/2015/10/21/chartex" xmlns:cx3="http://schemas.microsoft.com/office/drawing/2016/5/9/chartex" xmlns:cx4="http://schemas.microsoft.com/office/drawing/2016/5/10/chartex" xmlns:cx5="http://schemas.microsoft.com/office/drawing/2016/5/11/chartex" xmlns:cx6="http://schemas.microsoft.com/office/drawing/2016/5/12/chartex" xmlns:cx7="http://schemas.microsoft.com/office/drawing/2016/5/13/chartex" xmlns:cx8="http://schemas.microsoft.com/office/drawing/2016/5/14/chartex" xmlns:mc="http://schemas.openxmlformats.org/markup-compatibility/2006" xmlns:aink="http://schemas.microsoft.com/office/drawing/2016/ink" xmlns:am3d="http://schemas.microsoft.com/office/drawing/2017/model3d" xmlns:o="urn:schemas-microsoft-com:office:office" xmlns:r="http://schemas.openxmlformats.org/officeDocument/2006/relationships" xmlns:m="http://schemas.openxmlformats.org/officeDocument/2006/math" xmlns:v="urn:schemas-microsoft-com:vml" xmlns:wp14="http://schemas.microsoft.com/office/word/2010/wordprocessingDrawing" xmlns:wp="http://schemas.openxmlformats.org/drawingml/2006/wordprocessingDrawing" xmlns:w10="urn:schemas-microsoft-com:office:word" xmlns:w="http://schemas.openxmlformats.org/wordprocessingml/2006/main" xmlns:w14="http://schemas.microsoft.com/office/word/2010/wordml" xmlns:w15="http://schemas.microsoft.com/office/word/2012/wordml" xmlns:w16cex="http://schemas.microsoft.com/office/word/2018/wordml/cex" xmlns:w16cid="http://schemas.microsoft.com/office/word/2016/wordml/cid" xmlns:w16="http://schemas.microsoft.com/office/word/2018/wordml" xmlns:w16sdtdh="http://schemas.microsoft.com/office/word/2020/wordml/sdtdatahash" xmlns:w16se="http://schemas.microsoft.com/office/word/2015/wordml/symex" xmlns:wpg="http://schemas.microsoft.com/office/word/2010/wordprocessingGroup" xmlns:wpi="http://schemas.microsoft.com/office/word/2010/wordprocessingInk" xmlns:wne="http://schemas.microsoft.com/office/word/2006/wordml" xmlns:wps="http://schemas.microsoft.com/office/word/2010/wordprocessingShape" mc:Ignorable="w14 w15 w16se w16cid w16 w16cex w16sdtdh wp14">
   <w:abstractNum w:abstractNumId="0" w15:restartNumberingAfterBreak="0">
     <w:nsid w:val="69B63B8D"/>
     <w:multiLevelType w:val="hybridMultilevel"/>
@@ -704,7 +94,7 @@
         <w:ind w:left="720" w:hanging="360"/>
       </w:pPr>
       <w:rPr>
-        <w:rFonts w:hint="default" w:ascii="Symbol" w:hAnsi="Symbol"/>
+        <w:rFonts w:ascii="Symbol" w:hAnsi="Symbol" w:hint="default"/>
       </w:rPr>
     </w:lvl>
     <w:lvl w:ilvl="1" w:tplc="0C0A0003" w:tentative="1">
@@ -716,7 +106,7 @@
         <w:ind w:left="1440" w:hanging="360"/>
       </w:pPr>
       <w:rPr>
-        <w:rFonts w:hint="default" w:ascii="Courier New" w:hAnsi="Courier New" w:cs="Courier New"/>
+        <w:rFonts w:ascii="Courier New" w:hAnsi="Courier New" w:cs="Courier New" w:hint="default"/>
       </w:rPr>
     </w:lvl>
     <w:lvl w:ilvl="2" w:tplc="0C0A0005" w:tentative="1">
@@ -728,7 +118,7 @@
         <w:ind w:left="2160" w:hanging="360"/>
       </w:pPr>
       <w:rPr>
-        <w:rFonts w:hint="default" w:ascii="Wingdings" w:hAnsi="Wingdings"/>
+        <w:rFonts w:ascii="Wingdings" w:hAnsi="Wingdings" w:hint="default"/>
       </w:rPr>
     </w:lvl>
     <w:lvl w:ilvl="3" w:tplc="0C0A0001" w:tentative="1">
@@ -740,7 +130,7 @@
         <w:ind w:left="2880" w:hanging="360"/>
       </w:pPr>
       <w:rPr>
-        <w:rFonts w:hint="default" w:ascii="Symbol" w:hAnsi="Symbol"/>
+        <w:rFonts w:ascii="Symbol" w:hAnsi="Symbol" w:hint="default"/>
       </w:rPr>
     </w:lvl>
     <w:lvl w:ilvl="4" w:tplc="0C0A0003" w:tentative="1">
@@ -752,7 +142,7 @@
         <w:ind w:left="3600" w:hanging="360"/>
       </w:pPr>
       <w:rPr>
-        <w:rFonts w:hint="default" w:ascii="Courier New" w:hAnsi="Courier New" w:cs="Courier New"/>
+        <w:rFonts w:ascii="Courier New" w:hAnsi="Courier New" w:cs="Courier New" w:hint="default"/>
       </w:rPr>
     </w:lvl>
     <w:lvl w:ilvl="5" w:tplc="0C0A0005" w:tentative="1">
@@ -764,7 +154,7 @@
         <w:ind w:left="4320" w:hanging="360"/>
       </w:pPr>
       <w:rPr>
-        <w:rFonts w:hint="default" w:ascii="Wingdings" w:hAnsi="Wingdings"/>
+        <w:rFonts w:ascii="Wingdings" w:hAnsi="Wingdings" w:hint="default"/>
       </w:rPr>
     </w:lvl>
     <w:lvl w:ilvl="6" w:tplc="0C0A0001" w:tentative="1">
@@ -776,7 +166,7 @@
         <w:ind w:left="5040" w:hanging="360"/>
       </w:pPr>
       <w:rPr>
-        <w:rFonts w:hint="default" w:ascii="Symbol" w:hAnsi="Symbol"/>
+        <w:rFonts w:ascii="Symbol" w:hAnsi="Symbol" w:hint="default"/>
       </w:rPr>
     </w:lvl>
     <w:lvl w:ilvl="7" w:tplc="0C0A0003" w:tentative="1">
@@ -788,7 +178,7 @@
         <w:ind w:left="5760" w:hanging="360"/>
       </w:pPr>
       <w:rPr>
-        <w:rFonts w:hint="default" w:ascii="Courier New" w:hAnsi="Courier New" w:cs="Courier New"/>
+        <w:rFonts w:ascii="Courier New" w:hAnsi="Courier New" w:cs="Courier New" w:hint="default"/>
       </w:rPr>
     </w:lvl>
     <w:lvl w:ilvl="8" w:tplc="0C0A0005" w:tentative="1">
@@ -800,22 +190,22 @@
         <w:ind w:left="6480" w:hanging="360"/>
       </w:pPr>
       <w:rPr>
-        <w:rFonts w:hint="default" w:ascii="Wingdings" w:hAnsi="Wingdings"/>
+        <w:rFonts w:ascii="Wingdings" w:hAnsi="Wingdings" w:hint="default"/>
       </w:rPr>
     </w:lvl>
   </w:abstractNum>
-  <w:num w:numId="1" w16cid:durableId="1222255914">
+  <w:num w:numId="1">
     <w:abstractNumId w:val="0"/>
   </w:num>
 </w:numbering>
 </file>
 
 <file path=word/styles.xml><?xml version="1.0" encoding="utf-8"?>
-<w:styles xmlns:mc="http://schemas.openxmlformats.org/markup-compatibility/2006" xmlns:r="http://schemas.openxmlformats.org/officeDocument/2006/relationships" xmlns:w="http://schemas.openxmlformats.org/wordprocessingml/2006/main" xmlns:w14="http://schemas.microsoft.com/office/word/2010/wordml" xmlns:w15="http://schemas.microsoft.com/office/word/2012/wordml" xmlns:w16cex="http://schemas.microsoft.com/office/word/2018/wordml/cex" xmlns:w16cid="http://schemas.microsoft.com/office/word/2016/wordml/cid" xmlns:w16="http://schemas.microsoft.com/office/word/2018/wordml" xmlns:w16du="http://schemas.microsoft.com/office/word/2023/wordml/word16du" xmlns:w16sdtdh="http://schemas.microsoft.com/office/word/2020/wordml/sdtdatahash" xmlns:w16sdtfl="http://schemas.microsoft.com/office/word/2024/wordml/sdtformatlock" xmlns:w16se="http://schemas.microsoft.com/office/word/2015/wordml/symex" mc:Ignorable="w14 w15 w16se w16cid w16 w16cex w16sdtdh w16sdtfl w16du">
+<w:styles xmlns:mc="http://schemas.openxmlformats.org/markup-compatibility/2006" xmlns:r="http://schemas.openxmlformats.org/officeDocument/2006/relationships" xmlns:w="http://schemas.openxmlformats.org/wordprocessingml/2006/main" xmlns:w14="http://schemas.microsoft.com/office/word/2010/wordml" xmlns:w15="http://schemas.microsoft.com/office/word/2012/wordml" xmlns:w16cex="http://schemas.microsoft.com/office/word/2018/wordml/cex" xmlns:w16cid="http://schemas.microsoft.com/office/word/2016/wordml/cid" xmlns:w16="http://schemas.microsoft.com/office/word/2018/wordml" xmlns:w16sdtdh="http://schemas.microsoft.com/office/word/2020/wordml/sdtdatahash" xmlns:w16se="http://schemas.microsoft.com/office/word/2015/wordml/symex" mc:Ignorable="w14 w15 w16se w16cid w16 w16cex w16sdtdh">
   <w:docDefaults>
     <w:rPrDefault>
       <w:rPr>
-        <w:rFonts w:asciiTheme="minorHAnsi" w:hAnsiTheme="minorHAnsi" w:eastAsiaTheme="minorHAnsi" w:cstheme="minorBidi"/>
+        <w:rFonts w:asciiTheme="minorHAnsi" w:eastAsiaTheme="minorHAnsi" w:hAnsiTheme="minorHAnsi" w:cstheme="minorBidi"/>
         <w:kern w:val="2"/>
         <w:sz w:val="22"/>
         <w:szCs w:val="22"/>
@@ -832,14 +222,14 @@
   <w:latentStyles w:defLockedState="0" w:defUIPriority="99" w:defSemiHidden="0" w:defUnhideWhenUsed="0" w:defQFormat="0" w:count="376">
     <w:lsdException w:name="Normal" w:uiPriority="0" w:qFormat="1"/>
     <w:lsdException w:name="heading 1" w:uiPriority="9" w:qFormat="1"/>
-    <w:lsdException w:name="heading 2" w:uiPriority="9" w:semiHidden="1" w:unhideWhenUsed="1" w:qFormat="1"/>
-    <w:lsdException w:name="heading 3" w:uiPriority="9" w:semiHidden="1" w:unhideWhenUsed="1" w:qFormat="1"/>
-    <w:lsdException w:name="heading 4" w:uiPriority="9" w:semiHidden="1" w:unhideWhenUsed="1" w:qFormat="1"/>
-    <w:lsdException w:name="heading 5" w:uiPriority="9" w:semiHidden="1" w:unhideWhenUsed="1" w:qFormat="1"/>
-    <w:lsdException w:name="heading 6" w:uiPriority="9" w:semiHidden="1" w:unhideWhenUsed="1" w:qFormat="1"/>
-    <w:lsdException w:name="heading 7" w:uiPriority="9" w:semiHidden="1" w:unhideWhenUsed="1" w:qFormat="1"/>
-    <w:lsdException w:name="heading 8" w:uiPriority="9" w:semiHidden="1" w:unhideWhenUsed="1" w:qFormat="1"/>
-    <w:lsdException w:name="heading 9" w:uiPriority="9" w:semiHidden="1" w:unhideWhenUsed="1" w:qFormat="1"/>
+    <w:lsdException w:name="heading 2" w:semiHidden="1" w:uiPriority="9" w:unhideWhenUsed="1" w:qFormat="1"/>
+    <w:lsdException w:name="heading 3" w:semiHidden="1" w:uiPriority="9" w:unhideWhenUsed="1" w:qFormat="1"/>
+    <w:lsdException w:name="heading 4" w:semiHidden="1" w:uiPriority="9" w:unhideWhenUsed="1" w:qFormat="1"/>
+    <w:lsdException w:name="heading 5" w:semiHidden="1" w:uiPriority="9" w:unhideWhenUsed="1" w:qFormat="1"/>
+    <w:lsdException w:name="heading 6" w:semiHidden="1" w:uiPriority="9" w:unhideWhenUsed="1" w:qFormat="1"/>
+    <w:lsdException w:name="heading 7" w:semiHidden="1" w:uiPriority="9" w:unhideWhenUsed="1" w:qFormat="1"/>
+    <w:lsdException w:name="heading 8" w:semiHidden="1" w:uiPriority="9" w:unhideWhenUsed="1" w:qFormat="1"/>
+    <w:lsdException w:name="heading 9" w:semiHidden="1" w:uiPriority="9" w:unhideWhenUsed="1" w:qFormat="1"/>
     <w:lsdException w:name="index 1" w:semiHidden="1" w:unhideWhenUsed="1"/>
     <w:lsdException w:name="index 2" w:semiHidden="1" w:unhideWhenUsed="1"/>
     <w:lsdException w:name="index 3" w:semiHidden="1" w:unhideWhenUsed="1"/>
@@ -849,22 +239,22 @@
     <w:lsdException w:name="index 7" w:semiHidden="1" w:unhideWhenUsed="1"/>
     <w:lsdException w:name="index 8" w:semiHidden="1" w:unhideWhenUsed="1"/>
     <w:lsdException w:name="index 9" w:semiHidden="1" w:unhideWhenUsed="1"/>
-    <w:lsdException w:name="toc 1" w:uiPriority="39" w:semiHidden="1" w:unhideWhenUsed="1"/>
-    <w:lsdException w:name="toc 2" w:uiPriority="39" w:semiHidden="1" w:unhideWhenUsed="1"/>
-    <w:lsdException w:name="toc 3" w:uiPriority="39" w:semiHidden="1" w:unhideWhenUsed="1"/>
-    <w:lsdException w:name="toc 4" w:uiPriority="39" w:semiHidden="1" w:unhideWhenUsed="1"/>
-    <w:lsdException w:name="toc 5" w:uiPriority="39" w:semiHidden="1" w:unhideWhenUsed="1"/>
-    <w:lsdException w:name="toc 6" w:uiPriority="39" w:semiHidden="1" w:unhideWhenUsed="1"/>
-    <w:lsdException w:name="toc 7" w:uiPriority="39" w:semiHidden="1" w:unhideWhenUsed="1"/>
-    <w:lsdException w:name="toc 8" w:uiPriority="39" w:semiHidden="1" w:unhideWhenUsed="1"/>
-    <w:lsdException w:name="toc 9" w:uiPriority="39" w:semiHidden="1" w:unhideWhenUsed="1"/>
+    <w:lsdException w:name="toc 1" w:semiHidden="1" w:uiPriority="39" w:unhideWhenUsed="1"/>
+    <w:lsdException w:name="toc 2" w:semiHidden="1" w:uiPriority="39" w:unhideWhenUsed="1"/>
+    <w:lsdException w:name="toc 3" w:semiHidden="1" w:uiPriority="39" w:unhideWhenUsed="1"/>
+    <w:lsdException w:name="toc 4" w:semiHidden="1" w:uiPriority="39" w:unhideWhenUsed="1"/>
+    <w:lsdException w:name="toc 5" w:semiHidden="1" w:uiPriority="39" w:unhideWhenUsed="1"/>
+    <w:lsdException w:name="toc 6" w:semiHidden="1" w:uiPriority="39" w:unhideWhenUsed="1"/>
+    <w:lsdException w:name="toc 7" w:semiHidden="1" w:uiPriority="39" w:unhideWhenUsed="1"/>
+    <w:lsdException w:name="toc 8" w:semiHidden="1" w:uiPriority="39" w:unhideWhenUsed="1"/>
+    <w:lsdException w:name="toc 9" w:semiHidden="1" w:uiPriority="39" w:unhideWhenUsed="1"/>
     <w:lsdException w:name="Normal Indent" w:semiHidden="1" w:unhideWhenUsed="1"/>
     <w:lsdException w:name="footnote text" w:semiHidden="1" w:unhideWhenUsed="1"/>
     <w:lsdException w:name="annotation text" w:semiHidden="1" w:unhideWhenUsed="1"/>
     <w:lsdException w:name="header" w:semiHidden="1" w:unhideWhenUsed="1"/>
     <w:lsdException w:name="footer" w:semiHidden="1" w:unhideWhenUsed="1"/>
     <w:lsdException w:name="index heading" w:semiHidden="1" w:unhideWhenUsed="1"/>
-    <w:lsdException w:name="caption" w:uiPriority="35" w:semiHidden="1" w:unhideWhenUsed="1" w:qFormat="1"/>
+    <w:lsdException w:name="caption" w:semiHidden="1" w:uiPriority="35" w:unhideWhenUsed="1" w:qFormat="1"/>
     <w:lsdException w:name="table of figures" w:semiHidden="1" w:unhideWhenUsed="1"/>
     <w:lsdException w:name="envelope address" w:semiHidden="1" w:unhideWhenUsed="1"/>
     <w:lsdException w:name="envelope return" w:semiHidden="1" w:unhideWhenUsed="1"/>
@@ -895,7 +285,7 @@
     <w:lsdException w:name="Title" w:uiPriority="10" w:qFormat="1"/>
     <w:lsdException w:name="Closing" w:semiHidden="1" w:unhideWhenUsed="1"/>
     <w:lsdException w:name="Signature" w:semiHidden="1" w:unhideWhenUsed="1"/>
-    <w:lsdException w:name="Default Paragraph Font" w:uiPriority="1" w:semiHidden="1" w:unhideWhenUsed="1"/>
+    <w:lsdException w:name="Default Paragraph Font" w:semiHidden="1" w:uiPriority="1" w:unhideWhenUsed="1"/>
     <w:lsdException w:name="Body Text" w:semiHidden="1" w:unhideWhenUsed="1"/>
     <w:lsdException w:name="Body Text Indent" w:semiHidden="1" w:unhideWhenUsed="1"/>
     <w:lsdException w:name="List Continue" w:semiHidden="1" w:unhideWhenUsed="1"/>
@@ -1095,8 +485,8 @@
     <w:lsdException w:name="Subtle Reference" w:uiPriority="31" w:qFormat="1"/>
     <w:lsdException w:name="Intense Reference" w:uiPriority="32" w:qFormat="1"/>
     <w:lsdException w:name="Book Title" w:uiPriority="33" w:qFormat="1"/>
-    <w:lsdException w:name="Bibliography" w:uiPriority="37" w:semiHidden="1" w:unhideWhenUsed="1"/>
-    <w:lsdException w:name="TOC Heading" w:uiPriority="39" w:semiHidden="1" w:unhideWhenUsed="1" w:qFormat="1"/>
+    <w:lsdException w:name="Bibliography" w:semiHidden="1" w:uiPriority="37" w:unhideWhenUsed="1"/>
+    <w:lsdException w:name="TOC Heading" w:semiHidden="1" w:uiPriority="39" w:unhideWhenUsed="1" w:qFormat="1"/>
     <w:lsdException w:name="Plain Table 1" w:uiPriority="41"/>
     <w:lsdException w:name="Plain Table 2" w:uiPriority="42"/>
     <w:lsdException w:name="Plain Table 3" w:uiPriority="43"/>
@@ -1207,15 +597,15 @@
     <w:lsdException w:name="Unresolved Mention" w:semiHidden="1" w:unhideWhenUsed="1"/>
     <w:lsdException w:name="Smart Link" w:semiHidden="1" w:unhideWhenUsed="1"/>
   </w:latentStyles>
-  <w:style w:type="paragraph" w:styleId="Normal" w:default="1">
+  <w:style w:type="paragraph" w:default="1" w:styleId="Normal">
     <w:name w:val="Normal"/>
     <w:qFormat/>
   </w:style>
-  <w:style w:type="paragraph" w:styleId="Ttulo1">
+  <w:style w:type="paragraph" w:styleId="Heading1">
     <w:name w:val="heading 1"/>
     <w:basedOn w:val="Normal"/>
     <w:next w:val="Normal"/>
-    <w:link w:val="Ttulo1Car"/>
+    <w:link w:val="Heading1Char"/>
     <w:uiPriority w:val="9"/>
     <w:qFormat/>
     <w:rsid w:val="009F69CE"/>
@@ -1226,17 +616,17 @@
       <w:outlineLvl w:val="0"/>
     </w:pPr>
     <w:rPr>
-      <w:rFonts w:asciiTheme="majorHAnsi" w:hAnsiTheme="majorHAnsi" w:eastAsiaTheme="majorEastAsia" w:cstheme="majorBidi"/>
+      <w:rFonts w:asciiTheme="majorHAnsi" w:eastAsiaTheme="majorEastAsia" w:hAnsiTheme="majorHAnsi" w:cstheme="majorBidi"/>
       <w:color w:val="0F4761" w:themeColor="accent1" w:themeShade="BF"/>
       <w:sz w:val="40"/>
       <w:szCs w:val="40"/>
     </w:rPr>
   </w:style>
-  <w:style w:type="paragraph" w:styleId="Ttulo2">
+  <w:style w:type="paragraph" w:styleId="Heading2">
     <w:name w:val="heading 2"/>
     <w:basedOn w:val="Normal"/>
     <w:next w:val="Normal"/>
-    <w:link w:val="Ttulo2Car"/>
+    <w:link w:val="Heading2Char"/>
     <w:uiPriority w:val="9"/>
     <w:semiHidden/>
     <w:unhideWhenUsed/>
@@ -1249,17 +639,17 @@
       <w:outlineLvl w:val="1"/>
     </w:pPr>
     <w:rPr>
-      <w:rFonts w:asciiTheme="majorHAnsi" w:hAnsiTheme="majorHAnsi" w:eastAsiaTheme="majorEastAsia" w:cstheme="majorBidi"/>
+      <w:rFonts w:asciiTheme="majorHAnsi" w:eastAsiaTheme="majorEastAsia" w:hAnsiTheme="majorHAnsi" w:cstheme="majorBidi"/>
       <w:color w:val="0F4761" w:themeColor="accent1" w:themeShade="BF"/>
       <w:sz w:val="32"/>
       <w:szCs w:val="32"/>
     </w:rPr>
   </w:style>
-  <w:style w:type="paragraph" w:styleId="Ttulo3">
+  <w:style w:type="paragraph" w:styleId="Heading3">
     <w:name w:val="heading 3"/>
     <w:basedOn w:val="Normal"/>
     <w:next w:val="Normal"/>
-    <w:link w:val="Ttulo3Car"/>
+    <w:link w:val="Heading3Char"/>
     <w:uiPriority w:val="9"/>
     <w:semiHidden/>
     <w:unhideWhenUsed/>
@@ -1278,11 +668,11 @@
       <w:szCs w:val="28"/>
     </w:rPr>
   </w:style>
-  <w:style w:type="paragraph" w:styleId="Ttulo4">
+  <w:style w:type="paragraph" w:styleId="Heading4">
     <w:name w:val="heading 4"/>
     <w:basedOn w:val="Normal"/>
     <w:next w:val="Normal"/>
-    <w:link w:val="Ttulo4Car"/>
+    <w:link w:val="Heading4Char"/>
     <w:uiPriority w:val="9"/>
     <w:semiHidden/>
     <w:unhideWhenUsed/>
@@ -1301,11 +691,11 @@
       <w:color w:val="0F4761" w:themeColor="accent1" w:themeShade="BF"/>
     </w:rPr>
   </w:style>
-  <w:style w:type="paragraph" w:styleId="Ttulo5">
+  <w:style w:type="paragraph" w:styleId="Heading5">
     <w:name w:val="heading 5"/>
     <w:basedOn w:val="Normal"/>
     <w:next w:val="Normal"/>
-    <w:link w:val="Ttulo5Car"/>
+    <w:link w:val="Heading5Char"/>
     <w:uiPriority w:val="9"/>
     <w:semiHidden/>
     <w:unhideWhenUsed/>
@@ -1322,11 +712,11 @@
       <w:color w:val="0F4761" w:themeColor="accent1" w:themeShade="BF"/>
     </w:rPr>
   </w:style>
-  <w:style w:type="paragraph" w:styleId="Ttulo6">
+  <w:style w:type="paragraph" w:styleId="Heading6">
     <w:name w:val="heading 6"/>
     <w:basedOn w:val="Normal"/>
     <w:next w:val="Normal"/>
-    <w:link w:val="Ttulo6Car"/>
+    <w:link w:val="Heading6Char"/>
     <w:uiPriority w:val="9"/>
     <w:semiHidden/>
     <w:unhideWhenUsed/>
@@ -1345,11 +735,11 @@
       <w:color w:val="595959" w:themeColor="text1" w:themeTint="A6"/>
     </w:rPr>
   </w:style>
-  <w:style w:type="paragraph" w:styleId="Ttulo7">
+  <w:style w:type="paragraph" w:styleId="Heading7">
     <w:name w:val="heading 7"/>
     <w:basedOn w:val="Normal"/>
     <w:next w:val="Normal"/>
-    <w:link w:val="Ttulo7Car"/>
+    <w:link w:val="Heading7Char"/>
     <w:uiPriority w:val="9"/>
     <w:semiHidden/>
     <w:unhideWhenUsed/>
@@ -1366,11 +756,11 @@
       <w:color w:val="595959" w:themeColor="text1" w:themeTint="A6"/>
     </w:rPr>
   </w:style>
-  <w:style w:type="paragraph" w:styleId="Ttulo8">
+  <w:style w:type="paragraph" w:styleId="Heading8">
     <w:name w:val="heading 8"/>
     <w:basedOn w:val="Normal"/>
     <w:next w:val="Normal"/>
-    <w:link w:val="Ttulo8Car"/>
+    <w:link w:val="Heading8Char"/>
     <w:uiPriority w:val="9"/>
     <w:semiHidden/>
     <w:unhideWhenUsed/>
@@ -1389,11 +779,11 @@
       <w:color w:val="272727" w:themeColor="text1" w:themeTint="D8"/>
     </w:rPr>
   </w:style>
-  <w:style w:type="paragraph" w:styleId="Ttulo9">
+  <w:style w:type="paragraph" w:styleId="Heading9">
     <w:name w:val="heading 9"/>
     <w:basedOn w:val="Normal"/>
     <w:next w:val="Normal"/>
-    <w:link w:val="Ttulo9Car"/>
+    <w:link w:val="Heading9Char"/>
     <w:uiPriority w:val="9"/>
     <w:semiHidden/>
     <w:unhideWhenUsed/>
@@ -1410,13 +800,13 @@
       <w:color w:val="272727" w:themeColor="text1" w:themeTint="D8"/>
     </w:rPr>
   </w:style>
-  <w:style w:type="character" w:styleId="Fuentedeprrafopredeter" w:default="1">
+  <w:style w:type="character" w:default="1" w:styleId="DefaultParagraphFont">
     <w:name w:val="Default Paragraph Font"/>
     <w:uiPriority w:val="1"/>
     <w:semiHidden/>
     <w:unhideWhenUsed/>
   </w:style>
-  <w:style w:type="table" w:styleId="Tablanormal" w:default="1">
+  <w:style w:type="table" w:default="1" w:styleId="TableNormal">
     <w:name w:val="Normal Table"/>
     <w:uiPriority w:val="99"/>
     <w:semiHidden/>
@@ -1431,43 +821,43 @@
       </w:tblCellMar>
     </w:tblPr>
   </w:style>
-  <w:style w:type="numbering" w:styleId="Sinlista" w:default="1">
+  <w:style w:type="numbering" w:default="1" w:styleId="NoList">
     <w:name w:val="No List"/>
     <w:uiPriority w:val="99"/>
     <w:semiHidden/>
     <w:unhideWhenUsed/>
   </w:style>
-  <w:style w:type="character" w:styleId="Ttulo1Car" w:customStyle="1">
-    <w:name w:val="Título 1 Car"/>
-    <w:basedOn w:val="Fuentedeprrafopredeter"/>
-    <w:link w:val="Ttulo1"/>
+  <w:style w:type="character" w:customStyle="1" w:styleId="Heading1Char">
+    <w:name w:val="Heading 1 Char"/>
+    <w:basedOn w:val="DefaultParagraphFont"/>
+    <w:link w:val="Heading1"/>
     <w:uiPriority w:val="9"/>
     <w:rsid w:val="009F69CE"/>
     <w:rPr>
-      <w:rFonts w:asciiTheme="majorHAnsi" w:hAnsiTheme="majorHAnsi" w:eastAsiaTheme="majorEastAsia" w:cstheme="majorBidi"/>
+      <w:rFonts w:asciiTheme="majorHAnsi" w:eastAsiaTheme="majorEastAsia" w:hAnsiTheme="majorHAnsi" w:cstheme="majorBidi"/>
       <w:color w:val="0F4761" w:themeColor="accent1" w:themeShade="BF"/>
       <w:sz w:val="40"/>
       <w:szCs w:val="40"/>
     </w:rPr>
   </w:style>
-  <w:style w:type="character" w:styleId="Ttulo2Car" w:customStyle="1">
-    <w:name w:val="Título 2 Car"/>
-    <w:basedOn w:val="Fuentedeprrafopredeter"/>
-    <w:link w:val="Ttulo2"/>
+  <w:style w:type="character" w:customStyle="1" w:styleId="Heading2Char">
+    <w:name w:val="Heading 2 Char"/>
+    <w:basedOn w:val="DefaultParagraphFont"/>
+    <w:link w:val="Heading2"/>
     <w:uiPriority w:val="9"/>
     <w:semiHidden/>
     <w:rsid w:val="009F69CE"/>
     <w:rPr>
-      <w:rFonts w:asciiTheme="majorHAnsi" w:hAnsiTheme="majorHAnsi" w:eastAsiaTheme="majorEastAsia" w:cstheme="majorBidi"/>
+      <w:rFonts w:asciiTheme="majorHAnsi" w:eastAsiaTheme="majorEastAsia" w:hAnsiTheme="majorHAnsi" w:cstheme="majorBidi"/>
       <w:color w:val="0F4761" w:themeColor="accent1" w:themeShade="BF"/>
       <w:sz w:val="32"/>
       <w:szCs w:val="32"/>
     </w:rPr>
   </w:style>
-  <w:style w:type="character" w:styleId="Ttulo3Car" w:customStyle="1">
-    <w:name w:val="Título 3 Car"/>
-    <w:basedOn w:val="Fuentedeprrafopredeter"/>
-    <w:link w:val="Ttulo3"/>
+  <w:style w:type="character" w:customStyle="1" w:styleId="Heading3Char">
+    <w:name w:val="Heading 3 Char"/>
+    <w:basedOn w:val="DefaultParagraphFont"/>
+    <w:link w:val="Heading3"/>
     <w:uiPriority w:val="9"/>
     <w:semiHidden/>
     <w:rsid w:val="009F69CE"/>
@@ -1478,10 +868,10 @@
       <w:szCs w:val="28"/>
     </w:rPr>
   </w:style>
-  <w:style w:type="character" w:styleId="Ttulo4Car" w:customStyle="1">
-    <w:name w:val="Título 4 Car"/>
-    <w:basedOn w:val="Fuentedeprrafopredeter"/>
-    <w:link w:val="Ttulo4"/>
+  <w:style w:type="character" w:customStyle="1" w:styleId="Heading4Char">
+    <w:name w:val="Heading 4 Char"/>
+    <w:basedOn w:val="DefaultParagraphFont"/>
+    <w:link w:val="Heading4"/>
     <w:uiPriority w:val="9"/>
     <w:semiHidden/>
     <w:rsid w:val="009F69CE"/>
@@ -1492,10 +882,10 @@
       <w:color w:val="0F4761" w:themeColor="accent1" w:themeShade="BF"/>
     </w:rPr>
   </w:style>
-  <w:style w:type="character" w:styleId="Ttulo5Car" w:customStyle="1">
-    <w:name w:val="Título 5 Car"/>
-    <w:basedOn w:val="Fuentedeprrafopredeter"/>
-    <w:link w:val="Ttulo5"/>
+  <w:style w:type="character" w:customStyle="1" w:styleId="Heading5Char">
+    <w:name w:val="Heading 5 Char"/>
+    <w:basedOn w:val="DefaultParagraphFont"/>
+    <w:link w:val="Heading5"/>
     <w:uiPriority w:val="9"/>
     <w:semiHidden/>
     <w:rsid w:val="009F69CE"/>
@@ -1504,10 +894,10 @@
       <w:color w:val="0F4761" w:themeColor="accent1" w:themeShade="BF"/>
     </w:rPr>
   </w:style>
-  <w:style w:type="character" w:styleId="Ttulo6Car" w:customStyle="1">
-    <w:name w:val="Título 6 Car"/>
-    <w:basedOn w:val="Fuentedeprrafopredeter"/>
-    <w:link w:val="Ttulo6"/>
+  <w:style w:type="character" w:customStyle="1" w:styleId="Heading6Char">
+    <w:name w:val="Heading 6 Char"/>
+    <w:basedOn w:val="DefaultParagraphFont"/>
+    <w:link w:val="Heading6"/>
     <w:uiPriority w:val="9"/>
     <w:semiHidden/>
     <w:rsid w:val="009F69CE"/>
@@ -1518,10 +908,10 @@
       <w:color w:val="595959" w:themeColor="text1" w:themeTint="A6"/>
     </w:rPr>
   </w:style>
-  <w:style w:type="character" w:styleId="Ttulo7Car" w:customStyle="1">
-    <w:name w:val="Título 7 Car"/>
-    <w:basedOn w:val="Fuentedeprrafopredeter"/>
-    <w:link w:val="Ttulo7"/>
+  <w:style w:type="character" w:customStyle="1" w:styleId="Heading7Char">
+    <w:name w:val="Heading 7 Char"/>
+    <w:basedOn w:val="DefaultParagraphFont"/>
+    <w:link w:val="Heading7"/>
     <w:uiPriority w:val="9"/>
     <w:semiHidden/>
     <w:rsid w:val="009F69CE"/>
@@ -1530,10 +920,10 @@
       <w:color w:val="595959" w:themeColor="text1" w:themeTint="A6"/>
     </w:rPr>
   </w:style>
-  <w:style w:type="character" w:styleId="Ttulo8Car" w:customStyle="1">
-    <w:name w:val="Título 8 Car"/>
-    <w:basedOn w:val="Fuentedeprrafopredeter"/>
-    <w:link w:val="Ttulo8"/>
+  <w:style w:type="character" w:customStyle="1" w:styleId="Heading8Char">
+    <w:name w:val="Heading 8 Char"/>
+    <w:basedOn w:val="DefaultParagraphFont"/>
+    <w:link w:val="Heading8"/>
     <w:uiPriority w:val="9"/>
     <w:semiHidden/>
     <w:rsid w:val="009F69CE"/>
@@ -1544,10 +934,10 @@
       <w:color w:val="272727" w:themeColor="text1" w:themeTint="D8"/>
     </w:rPr>
   </w:style>
-  <w:style w:type="character" w:styleId="Ttulo9Car" w:customStyle="1">
-    <w:name w:val="Título 9 Car"/>
-    <w:basedOn w:val="Fuentedeprrafopredeter"/>
-    <w:link w:val="Ttulo9"/>
+  <w:style w:type="character" w:customStyle="1" w:styleId="Heading9Char">
+    <w:name w:val="Heading 9 Char"/>
+    <w:basedOn w:val="DefaultParagraphFont"/>
+    <w:link w:val="Heading9"/>
     <w:uiPriority w:val="9"/>
     <w:semiHidden/>
     <w:rsid w:val="009F69CE"/>
@@ -1556,11 +946,11 @@
       <w:color w:val="272727" w:themeColor="text1" w:themeTint="D8"/>
     </w:rPr>
   </w:style>
-  <w:style w:type="paragraph" w:styleId="Ttulo">
+  <w:style w:type="paragraph" w:styleId="Title">
     <w:name w:val="Title"/>
     <w:basedOn w:val="Normal"/>
     <w:next w:val="Normal"/>
-    <w:link w:val="TtuloCar"/>
+    <w:link w:val="TitleChar"/>
     <w:uiPriority w:val="10"/>
     <w:qFormat/>
     <w:rsid w:val="009F69CE"/>
@@ -1569,32 +959,32 @@
       <w:contextualSpacing/>
     </w:pPr>
     <w:rPr>
-      <w:rFonts w:asciiTheme="majorHAnsi" w:hAnsiTheme="majorHAnsi" w:eastAsiaTheme="majorEastAsia" w:cstheme="majorBidi"/>
+      <w:rFonts w:asciiTheme="majorHAnsi" w:eastAsiaTheme="majorEastAsia" w:hAnsiTheme="majorHAnsi" w:cstheme="majorBidi"/>
       <w:spacing w:val="-10"/>
       <w:kern w:val="28"/>
       <w:sz w:val="56"/>
       <w:szCs w:val="56"/>
     </w:rPr>
   </w:style>
-  <w:style w:type="character" w:styleId="TtuloCar" w:customStyle="1">
-    <w:name w:val="Título Car"/>
-    <w:basedOn w:val="Fuentedeprrafopredeter"/>
-    <w:link w:val="Ttulo"/>
+  <w:style w:type="character" w:customStyle="1" w:styleId="TitleChar">
+    <w:name w:val="Title Char"/>
+    <w:basedOn w:val="DefaultParagraphFont"/>
+    <w:link w:val="Title"/>
     <w:uiPriority w:val="10"/>
     <w:rsid w:val="009F69CE"/>
     <w:rPr>
-      <w:rFonts w:asciiTheme="majorHAnsi" w:hAnsiTheme="majorHAnsi" w:eastAsiaTheme="majorEastAsia" w:cstheme="majorBidi"/>
+      <w:rFonts w:asciiTheme="majorHAnsi" w:eastAsiaTheme="majorEastAsia" w:hAnsiTheme="majorHAnsi" w:cstheme="majorBidi"/>
       <w:spacing w:val="-10"/>
       <w:kern w:val="28"/>
       <w:sz w:val="56"/>
       <w:szCs w:val="56"/>
     </w:rPr>
   </w:style>
-  <w:style w:type="paragraph" w:styleId="Subttulo">
+  <w:style w:type="paragraph" w:styleId="Subtitle">
     <w:name w:val="Subtitle"/>
     <w:basedOn w:val="Normal"/>
     <w:next w:val="Normal"/>
-    <w:link w:val="SubttuloCar"/>
+    <w:link w:val="SubtitleChar"/>
     <w:uiPriority w:val="11"/>
     <w:qFormat/>
     <w:rsid w:val="009F69CE"/>
@@ -1611,10 +1001,10 @@
       <w:szCs w:val="28"/>
     </w:rPr>
   </w:style>
-  <w:style w:type="character" w:styleId="SubttuloCar" w:customStyle="1">
-    <w:name w:val="Subtítulo Car"/>
-    <w:basedOn w:val="Fuentedeprrafopredeter"/>
-    <w:link w:val="Subttulo"/>
+  <w:style w:type="character" w:customStyle="1" w:styleId="SubtitleChar">
+    <w:name w:val="Subtitle Char"/>
+    <w:basedOn w:val="DefaultParagraphFont"/>
+    <w:link w:val="Subtitle"/>
     <w:uiPriority w:val="11"/>
     <w:rsid w:val="009F69CE"/>
     <w:rPr>
@@ -1625,11 +1015,11 @@
       <w:szCs w:val="28"/>
     </w:rPr>
   </w:style>
-  <w:style w:type="paragraph" w:styleId="Cita">
+  <w:style w:type="paragraph" w:styleId="Quote">
     <w:name w:val="Quote"/>
     <w:basedOn w:val="Normal"/>
     <w:next w:val="Normal"/>
-    <w:link w:val="CitaCar"/>
+    <w:link w:val="QuoteChar"/>
     <w:uiPriority w:val="29"/>
     <w:qFormat/>
     <w:rsid w:val="009F69CE"/>
@@ -1643,10 +1033,10 @@
       <w:color w:val="404040" w:themeColor="text1" w:themeTint="BF"/>
     </w:rPr>
   </w:style>
-  <w:style w:type="character" w:styleId="CitaCar" w:customStyle="1">
-    <w:name w:val="Cita Car"/>
-    <w:basedOn w:val="Fuentedeprrafopredeter"/>
-    <w:link w:val="Cita"/>
+  <w:style w:type="character" w:customStyle="1" w:styleId="QuoteChar">
+    <w:name w:val="Quote Char"/>
+    <w:basedOn w:val="DefaultParagraphFont"/>
+    <w:link w:val="Quote"/>
     <w:uiPriority w:val="29"/>
     <w:rsid w:val="009F69CE"/>
     <w:rPr>
@@ -1655,7 +1045,7 @@
       <w:color w:val="404040" w:themeColor="text1" w:themeTint="BF"/>
     </w:rPr>
   </w:style>
-  <w:style w:type="paragraph" w:styleId="Prrafodelista">
+  <w:style w:type="paragraph" w:styleId="ListParagraph">
     <w:name w:val="List Paragraph"/>
     <w:basedOn w:val="Normal"/>
     <w:uiPriority w:val="34"/>
@@ -1666,9 +1056,9 @@
       <w:contextualSpacing/>
     </w:pPr>
   </w:style>
-  <w:style w:type="character" w:styleId="nfasisintenso">
+  <w:style w:type="character" w:styleId="IntenseEmphasis">
     <w:name w:val="Intense Emphasis"/>
-    <w:basedOn w:val="Fuentedeprrafopredeter"/>
+    <w:basedOn w:val="DefaultParagraphFont"/>
     <w:uiPriority w:val="21"/>
     <w:qFormat/>
     <w:rsid w:val="009F69CE"/>
@@ -1678,18 +1068,18 @@
       <w:color w:val="0F4761" w:themeColor="accent1" w:themeShade="BF"/>
     </w:rPr>
   </w:style>
-  <w:style w:type="paragraph" w:styleId="Citadestacada">
+  <w:style w:type="paragraph" w:styleId="IntenseQuote">
     <w:name w:val="Intense Quote"/>
     <w:basedOn w:val="Normal"/>
     <w:next w:val="Normal"/>
-    <w:link w:val="CitadestacadaCar"/>
+    <w:link w:val="IntenseQuoteChar"/>
     <w:uiPriority w:val="30"/>
     <w:qFormat/>
     <w:rsid w:val="009F69CE"/>
     <w:pPr>
       <w:pBdr>
-        <w:top w:val="single" w:color="0F4761" w:themeColor="accent1" w:themeShade="BF" w:sz="4" w:space="10"/>
-        <w:bottom w:val="single" w:color="0F4761" w:themeColor="accent1" w:themeShade="BF" w:sz="4" w:space="10"/>
+        <w:top w:val="single" w:sz="4" w:space="10" w:color="0F4761" w:themeColor="accent1" w:themeShade="BF"/>
+        <w:bottom w:val="single" w:sz="4" w:space="10" w:color="0F4761" w:themeColor="accent1" w:themeShade="BF"/>
       </w:pBdr>
       <w:spacing w:before="360" w:after="360"/>
       <w:ind w:left="864" w:right="864"/>
@@ -1701,10 +1091,10 @@
       <w:color w:val="0F4761" w:themeColor="accent1" w:themeShade="BF"/>
     </w:rPr>
   </w:style>
-  <w:style w:type="character" w:styleId="CitadestacadaCar" w:customStyle="1">
-    <w:name w:val="Cita destacada Car"/>
-    <w:basedOn w:val="Fuentedeprrafopredeter"/>
-    <w:link w:val="Citadestacada"/>
+  <w:style w:type="character" w:customStyle="1" w:styleId="IntenseQuoteChar">
+    <w:name w:val="Intense Quote Char"/>
+    <w:basedOn w:val="DefaultParagraphFont"/>
+    <w:link w:val="IntenseQuote"/>
     <w:uiPriority w:val="30"/>
     <w:rsid w:val="009F69CE"/>
     <w:rPr>
@@ -1713,9 +1103,9 @@
       <w:color w:val="0F4761" w:themeColor="accent1" w:themeShade="BF"/>
     </w:rPr>
   </w:style>
-  <w:style w:type="character" w:styleId="Referenciaintensa">
+  <w:style w:type="character" w:styleId="IntenseReference">
     <w:name w:val="Intense Reference"/>
-    <w:basedOn w:val="Fuentedeprrafopredeter"/>
+    <w:basedOn w:val="DefaultParagraphFont"/>
     <w:uiPriority w:val="32"/>
     <w:qFormat/>
     <w:rsid w:val="009F69CE"/>
@@ -1737,12 +1127,23 @@
       <w:spacing w:before="100" w:beforeAutospacing="1" w:after="100" w:afterAutospacing="1" w:line="240" w:lineRule="auto"/>
     </w:pPr>
     <w:rPr>
-      <w:rFonts w:ascii="Times New Roman" w:hAnsi="Times New Roman" w:eastAsia="Times New Roman" w:cs="Times New Roman"/>
+      <w:rFonts w:ascii="Times New Roman" w:eastAsia="Times New Roman" w:hAnsi="Times New Roman" w:cs="Times New Roman"/>
       <w:kern w:val="0"/>
       <w:sz w:val="24"/>
       <w:szCs w:val="24"/>
       <w:lang w:eastAsia="es-ES"/>
       <w14:ligatures w14:val="none"/>
+    </w:rPr>
+  </w:style>
+  <w:style w:type="character" w:styleId="Strong">
+    <w:name w:val="Strong"/>
+    <w:basedOn w:val="DefaultParagraphFont"/>
+    <w:uiPriority w:val="22"/>
+    <w:qFormat/>
+    <w:rsid w:val="00FA5536"/>
+    <w:rPr>
+      <w:b/>
+      <w:bCs/>
     </w:rPr>
   </w:style>
 </w:styles>
@@ -2293,15 +1694,6 @@
 </file>
 
 <file path=customXml/item2.xml><?xml version="1.0" encoding="utf-8"?>
-<?mso-contentType ?>
-<FormTemplates xmlns="http://schemas.microsoft.com/sharepoint/v3/contenttype/forms">
-  <Display>DocumentLibraryForm</Display>
-  <Edit>DocumentLibraryForm</Edit>
-  <New>DocumentLibraryForm</New>
-</FormTemplates>
-</file>
-
-<file path=customXml/item3.xml><?xml version="1.0" encoding="utf-8"?>
 <p:properties xmlns:p="http://schemas.microsoft.com/office/2006/metadata/properties" xmlns:xsi="http://www.w3.org/2001/XMLSchema-instance" xmlns:pc="http://schemas.microsoft.com/office/infopath/2007/PartnerControls">
   <documentManagement>
     <lcf76f155ced4ddcb4097134ff3c332f xmlns="74f61a1d-ba3c-40f3-bdcc-eb6e7e476def">
@@ -2312,14 +1704,49 @@
 </p:properties>
 </file>
 
+<file path=customXml/item3.xml><?xml version="1.0" encoding="utf-8"?>
+<?mso-contentType ?>
+<FormTemplates xmlns="http://schemas.microsoft.com/sharepoint/v3/contenttype/forms">
+  <Display>DocumentLibraryForm</Display>
+  <Edit>DocumentLibraryForm</Edit>
+  <New>DocumentLibraryForm</New>
+</FormTemplates>
+</file>
+
 <file path=customXml/itemProps1.xml><?xml version="1.0" encoding="utf-8"?>
-<ds:datastoreItem xmlns:ds="http://schemas.openxmlformats.org/officeDocument/2006/customXml" ds:itemID="{AF815BF4-7EF4-47D4-A40E-0790D69A96B8}"/>
+<ds:datastoreItem xmlns:ds="http://schemas.openxmlformats.org/officeDocument/2006/customXml" ds:itemID="{AF815BF4-7EF4-47D4-A40E-0790D69A96B8}">
+  <ds:schemaRefs>
+    <ds:schemaRef ds:uri="http://schemas.microsoft.com/office/2006/metadata/contentType"/>
+    <ds:schemaRef ds:uri="http://schemas.microsoft.com/office/2006/metadata/properties/metaAttributes"/>
+    <ds:schemaRef ds:uri="http://www.w3.org/2001/XMLSchema"/>
+    <ds:schemaRef ds:uri="http://schemas.microsoft.com/office/2006/metadata/properties"/>
+    <ds:schemaRef ds:uri="74f61a1d-ba3c-40f3-bdcc-eb6e7e476def"/>
+    <ds:schemaRef ds:uri="740f4089-3d08-4951-bf8c-10da003d7c19"/>
+    <ds:schemaRef ds:uri="http://schemas.microsoft.com/office/2006/documentManagement/types"/>
+    <ds:schemaRef ds:uri="http://schemas.microsoft.com/office/infopath/2007/PartnerControls"/>
+    <ds:schemaRef ds:uri="http://schemas.openxmlformats.org/package/2006/metadata/core-properties"/>
+    <ds:schemaRef ds:uri="http://purl.org/dc/elements/1.1/"/>
+    <ds:schemaRef ds:uri="http://purl.org/dc/terms/"/>
+    <ds:schemaRef ds:uri="http://schemas.microsoft.com/internal/obd"/>
+  </ds:schemaRefs>
+</ds:datastoreItem>
 </file>
 
 <file path=customXml/itemProps2.xml><?xml version="1.0" encoding="utf-8"?>
-<ds:datastoreItem xmlns:ds="http://schemas.openxmlformats.org/officeDocument/2006/customXml" ds:itemID="{7EF376F5-8964-4DD5-9672-4C4F9CEFDCC1}"/>
+<ds:datastoreItem xmlns:ds="http://schemas.openxmlformats.org/officeDocument/2006/customXml" ds:itemID="{CAAE3E3F-BBDD-4939-A565-487E4892A5B1}">
+  <ds:schemaRefs>
+    <ds:schemaRef ds:uri="http://schemas.microsoft.com/office/2006/metadata/properties"/>
+    <ds:schemaRef ds:uri="http://schemas.microsoft.com/office/infopath/2007/PartnerControls"/>
+    <ds:schemaRef ds:uri="74f61a1d-ba3c-40f3-bdcc-eb6e7e476def"/>
+    <ds:schemaRef ds:uri="740f4089-3d08-4951-bf8c-10da003d7c19"/>
+  </ds:schemaRefs>
+</ds:datastoreItem>
 </file>
 
 <file path=customXml/itemProps3.xml><?xml version="1.0" encoding="utf-8"?>
-<ds:datastoreItem xmlns:ds="http://schemas.openxmlformats.org/officeDocument/2006/customXml" ds:itemID="{CAAE3E3F-BBDD-4939-A565-487E4892A5B1}"/>
+<ds:datastoreItem xmlns:ds="http://schemas.openxmlformats.org/officeDocument/2006/customXml" ds:itemID="{7EF376F5-8964-4DD5-9672-4C4F9CEFDCC1}">
+  <ds:schemaRefs>
+    <ds:schemaRef ds:uri="http://schemas.microsoft.com/sharepoint/v3/contenttype/forms"/>
+  </ds:schemaRefs>
+</ds:datastoreItem>
 </file>
</xml_diff>